<commit_message>
feat(ex5): Made changes on exercise 5 and it's report
</commit_message>
<xml_diff>
--- a/PRACTICE_8/G03_Report_08.docx
+++ b/PRACTICE_8/G03_Report_08.docx
@@ -391,27 +391,185 @@
     <w:p>
       <w:pPr>
         <w:pStyle w:val="Normal"/>
-      </w:pPr>
-      <w:r>
-        <w:rPr/>
-        <w:t>The choice of alpha impacts how LVQ adjusts prototypes across epochs. A lower learning rate (0.3), in this specific case, led to a slightly lower total error compared to a higher learning rate (0.9).</w:t>
-      </w:r>
-    </w:p>
-    <w:p>
-      <w:pPr>
-        <w:pStyle w:val="Normal"/>
-      </w:pPr>
-    </w:p>
-    <w:p>
-      <w:pPr>
-        <w:pStyle w:val="Normal"/>
+        <w:suppressLineNumbers w:val="0"/>
+        <w:bidi w:val="0"/>
+        <w:spacing w:before="0" w:beforeAutospacing="off" w:after="160" w:afterAutospacing="off" w:line="259" w:lineRule="auto"/>
+        <w:ind w:left="0" w:right="0"/>
+        <w:jc w:val="left"/>
+        <w:rPr>
+          <w:b w:val="0"/>
+          <w:bCs w:val="0"/>
+          <w:lang w:val="en-US"/>
+        </w:rPr>
+      </w:pPr>
+      <w:r>
+        <w:rPr>
+          <w:b w:val="1"/>
+          <w:bCs w:val="1"/>
+          <w:lang w:val="en-US"/>
+        </w:rPr>
+        <w:t>Observações</w:t>
+      </w:r>
+      <w:r>
+        <w:rPr>
+          <w:b w:val="1"/>
+          <w:bCs w:val="1"/>
+          <w:lang w:val="en-US"/>
+        </w:rPr>
+        <w:t>:</w:t>
+      </w:r>
+    </w:p>
+    <w:p>
+      <w:pPr>
+        <w:pStyle w:val="Normal"/>
+        <w:bidi w:val="0"/>
+        <w:spacing w:before="0" w:beforeAutospacing="off" w:after="160" w:afterAutospacing="off" w:line="259" w:lineRule="auto"/>
+        <w:ind w:left="0" w:right="0"/>
+        <w:jc w:val="left"/>
+        <w:rPr>
+          <w:b w:val="0"/>
+          <w:bCs w:val="0"/>
+          <w:lang w:val="en-US"/>
+        </w:rPr>
+      </w:pPr>
+      <w:r>
+        <w:rPr>
+          <w:b w:val="0"/>
+          <w:bCs w:val="0"/>
+          <w:lang w:val="en-US"/>
+        </w:rPr>
+        <w:t>O erro diminui rapidamente de 27,7 para ~17 nas primeiras 10 épocas (fase de aprendizagem acentuada)</w:t>
+      </w:r>
+    </w:p>
+    <w:p>
+      <w:pPr>
+        <w:pStyle w:val="Normal"/>
+        <w:bidi w:val="0"/>
+        <w:spacing w:before="0" w:beforeAutospacing="off" w:after="160" w:afterAutospacing="off" w:line="259" w:lineRule="auto"/>
+        <w:ind w:left="0" w:right="0"/>
+        <w:jc w:val="left"/>
+      </w:pPr>
+      <w:r>
+        <w:rPr>
+          <w:b w:val="0"/>
+          <w:bCs w:val="0"/>
+          <w:lang w:val="en-US"/>
+        </w:rPr>
+        <w:t>Retornos decrescentes após 25 épocas, convergindo para ~15,3</w:t>
+      </w:r>
+    </w:p>
+    <w:p>
+      <w:pPr>
+        <w:pStyle w:val="Normal"/>
+        <w:bidi w:val="0"/>
+        <w:spacing w:before="0" w:beforeAutospacing="off" w:after="160" w:afterAutospacing="off" w:line="259" w:lineRule="auto"/>
+        <w:ind w:left="0" w:right="0"/>
+        <w:jc w:val="left"/>
+      </w:pPr>
+      <w:r>
+        <w:rPr>
+          <w:b w:val="0"/>
+          <w:bCs w:val="0"/>
+          <w:lang w:val="en-US"/>
+        </w:rPr>
+        <w:t>Treino para além de 50 épocas proporciona melhorias mínimas (redução &lt;1%)</w:t>
+      </w:r>
+    </w:p>
+    <w:p>
+      <w:pPr>
+        <w:pStyle w:val="Normal"/>
+        <w:bidi w:val="0"/>
+        <w:spacing w:before="0" w:beforeAutospacing="off" w:after="160" w:afterAutospacing="off" w:line="259" w:lineRule="auto"/>
+        <w:ind w:left="0" w:right="0"/>
+        <w:jc w:val="left"/>
+        <w:rPr>
+          <w:b w:val="0"/>
+          <w:bCs w:val="0"/>
+          <w:lang w:val="pt-BR"/>
+        </w:rPr>
+      </w:pPr>
+    </w:p>
+    <w:p>
+      <w:pPr>
+        <w:pStyle w:val="Normal"/>
+        <w:bidi w:val="0"/>
+        <w:spacing w:before="0" w:beforeAutospacing="off" w:after="160" w:afterAutospacing="off" w:line="259" w:lineRule="auto"/>
+        <w:ind w:left="0" w:right="0"/>
+        <w:jc w:val="left"/>
+      </w:pPr>
+      <w:r>
+        <w:rPr>
+          <w:b w:val="1"/>
+          <w:bCs w:val="1"/>
+          <w:lang w:val="pt-BR"/>
+        </w:rPr>
+        <w:t>Conclusão prática:</w:t>
+      </w:r>
+      <w:r>
+        <w:rPr>
+          <w:b w:val="0"/>
+          <w:bCs w:val="0"/>
+          <w:lang w:val="pt-BR"/>
+        </w:rPr>
+        <w:t xml:space="preserve"> 20-30 épocas são suficientes para este </w:t>
+      </w:r>
+      <w:r>
+        <w:rPr>
+          <w:b w:val="0"/>
+          <w:bCs w:val="0"/>
+          <w:lang w:val="pt-BR"/>
+        </w:rPr>
+        <w:t>dataset</w:t>
+      </w:r>
+      <w:r>
+        <w:rPr>
+          <w:b w:val="0"/>
+          <w:bCs w:val="0"/>
+          <w:lang w:val="pt-BR"/>
+        </w:rPr>
+        <w:t>; 100 épocas é excessivo</w:t>
+      </w:r>
+    </w:p>
+    <w:p>
+      <w:pPr>
+        <w:pStyle w:val="Normal"/>
+        <w:suppressLineNumbers w:val="0"/>
+        <w:bidi w:val="0"/>
+        <w:spacing w:before="0" w:beforeAutospacing="off" w:after="160" w:afterAutospacing="off" w:line="259" w:lineRule="auto"/>
+        <w:ind w:left="0" w:right="0"/>
+        <w:jc w:val="left"/>
+        <w:rPr>
+          <w:b w:val="1"/>
+          <w:bCs w:val="1"/>
+          <w:lang w:val="en-US"/>
+        </w:rPr>
+      </w:pPr>
+    </w:p>
+    <w:p>
+      <w:pPr>
+        <w:pStyle w:val="Normal"/>
+        <w:suppressLineNumbers w:val="0"/>
+        <w:bidi w:val="0"/>
+        <w:spacing w:before="0" w:beforeAutospacing="off" w:after="160" w:afterAutospacing="off" w:line="259" w:lineRule="auto"/>
+        <w:ind w:left="0" w:right="0"/>
+        <w:jc w:val="left"/>
+        <w:rPr>
+          <w:b w:val="1"/>
+          <w:bCs w:val="1"/>
+        </w:rPr>
+      </w:pPr>
+    </w:p>
+    <w:p>
+      <w:pPr>
+        <w:pStyle w:val="Normal"/>
+        <w:jc w:val="center"/>
       </w:pPr>
       <w:r>
         <w:drawing>
-          <wp:inline wp14:editId="5592CF1A" wp14:anchorId="37BA9058">
-            <wp:extent cx="5019675" cy="5400675"/>
+          <wp:inline wp14:editId="24ECFA9F" wp14:anchorId="62CCBF3C">
+            <wp:extent cx="5400675" cy="3667125"/>
             <wp:effectExtent l="0" t="0" r="0" b="0"/>
-            <wp:docPr id="779785223" name="drawing"/>
+            <wp:docPr id="280336111" name="drawing"/>
             <wp:cNvGraphicFramePr>
               <a:graphicFrameLocks noChangeAspect="1"/>
             </wp:cNvGraphicFramePr>
@@ -419,11 +577,11 @@
               <a:graphicData xmlns:a="http://schemas.openxmlformats.org/drawingml/2006/main" uri="http://schemas.openxmlformats.org/drawingml/2006/picture">
                 <pic:pic xmlns:pic="http://schemas.openxmlformats.org/drawingml/2006/picture">
                   <pic:nvPicPr>
-                    <pic:cNvPr id="779785223" name="Picture 779785223"/>
+                    <pic:cNvPr id="280336111" name="Picture 280336111"/>
                     <pic:cNvPicPr/>
                   </pic:nvPicPr>
                   <pic:blipFill>
-                    <a:blip xmlns:r="http://schemas.openxmlformats.org/officeDocument/2006/relationships" r:embed="rId1173239711">
+                    <a:blip xmlns:r="http://schemas.openxmlformats.org/officeDocument/2006/relationships" r:embed="rId1570573827">
                       <a:extLst>
                         <a:ext uri="{28A0092B-C50C-407E-A947-70E740481C1C}">
                           <a14:useLocalDpi xmlns:a14="http://schemas.microsoft.com/office/drawing/2010/main"/>
@@ -437,7 +595,7 @@
                   <pic:spPr>
                     <a:xfrm>
                       <a:off x="0" y="0"/>
-                      <a:ext cx="5019675" cy="5400675"/>
+                      <a:ext cx="5400675" cy="3667125"/>
                     </a:xfrm>
                     <a:prstGeom prst="rect">
                       <a:avLst/>
@@ -449,11 +607,6 @@
           </wp:inline>
         </w:drawing>
       </w:r>
-    </w:p>
-    <w:p>
-      <w:pPr>
-        <w:pStyle w:val="Normal"/>
-      </w:pPr>
       <w:r>
         <w:rPr/>
         <w:t>Figure 1</w:t>
@@ -464,52 +617,214 @@
       </w:r>
       <w:r>
         <w:rPr/>
-        <w:t xml:space="preserve">100 </w:t>
-      </w:r>
+        <w:t>5b_epochs_vs_error.png</w:t>
+      </w:r>
+    </w:p>
+    <w:p>
+      <w:pPr>
+        <w:pStyle w:val="Normal"/>
+      </w:pPr>
+    </w:p>
+    <w:p>
+      <w:pPr>
+        <w:pStyle w:val="Normal"/>
+      </w:pPr>
+    </w:p>
+    <w:p>
+      <w:pPr>
+        <w:pStyle w:val="Normal"/>
+      </w:pPr>
+    </w:p>
+    <w:p>
+      <w:pPr>
+        <w:pStyle w:val="Normal"/>
+      </w:pPr>
+    </w:p>
+    <w:p>
+      <w:pPr>
+        <w:pStyle w:val="Normal"/>
+      </w:pPr>
+    </w:p>
+    <w:p>
+      <w:pPr>
+        <w:pStyle w:val="Normal"/>
+      </w:pPr>
+    </w:p>
+    <w:p>
+      <w:pPr>
+        <w:pStyle w:val="Normal"/>
+      </w:pPr>
+    </w:p>
+    <w:p>
+      <w:pPr>
+        <w:pStyle w:val="Normal"/>
+      </w:pPr>
+    </w:p>
+    <w:p>
+      <w:pPr>
+        <w:pStyle w:val="Normal"/>
+      </w:pPr>
+    </w:p>
+    <w:p>
+      <w:pPr>
+        <w:pStyle w:val="Normal"/>
+        <w:rPr>
+          <w:rFonts w:ascii="Aptos" w:hAnsi="Aptos" w:eastAsia="Aptos" w:cs="Aptos"/>
+          <w:noProof w:val="0"/>
+          <w:sz w:val="22"/>
+          <w:szCs w:val="22"/>
+          <w:lang w:val="pt-PT"/>
+        </w:rPr>
+      </w:pPr>
       <w:r>
         <w:rPr/>
-        <w:t>epoch</w:t>
+        <w:t>5. c</w:t>
+      </w:r>
+      <w:r>
+        <w:rPr/>
+        <w:t>)</w:t>
       </w:r>
       <w:r>
         <w:rPr/>
         <w:t xml:space="preserve"> </w:t>
       </w:r>
-      <w:r>
-        <w:rPr/>
-        <w:t>with</w:t>
-      </w:r>
-      <w:r>
-        <w:rPr/>
-        <w:t xml:space="preserve"> </w:t>
-      </w:r>
-      <w:r>
-        <w:rPr/>
-        <w:t>learning</w:t>
-      </w:r>
-      <w:r>
-        <w:rPr/>
-        <w:t xml:space="preserve"> rate </w:t>
-      </w:r>
-      <w:r>
-        <w:rPr/>
-        <w:t>of</w:t>
-      </w:r>
-      <w:r>
-        <w:rPr/>
-        <w:t xml:space="preserve"> 0</w:t>
-      </w:r>
-      <w:r>
-        <w:rPr/>
-        <w:t>.</w:t>
-      </w:r>
-      <w:r>
-        <w:rPr/>
-        <w:t>3</w:t>
-      </w:r>
-    </w:p>
-    <w:p>
-      <w:pPr>
-        <w:pStyle w:val="Normal"/>
+    </w:p>
+    <w:p>
+      <w:pPr>
+        <w:pStyle w:val="Normal"/>
+        <w:rPr>
+          <w:b w:val="1"/>
+          <w:bCs w:val="1"/>
+        </w:rPr>
+      </w:pPr>
+      <w:r>
+        <w:rPr>
+          <w:b w:val="1"/>
+          <w:bCs w:val="1"/>
+        </w:rPr>
+        <w:t>Observações:</w:t>
+      </w:r>
+    </w:p>
+    <w:p>
+      <w:pPr>
+        <w:pStyle w:val="Normal"/>
+        <w:rPr>
+          <w:b w:val="0"/>
+          <w:bCs w:val="0"/>
+        </w:rPr>
+      </w:pPr>
+      <w:r>
+        <w:rPr>
+          <w:b w:val="0"/>
+          <w:bCs w:val="0"/>
+        </w:rPr>
+        <w:t>Codebooks</w:t>
+      </w:r>
+      <w:r>
+        <w:rPr>
+          <w:b w:val="0"/>
+          <w:bCs w:val="0"/>
+        </w:rPr>
+        <w:t xml:space="preserve"> pequenos (2-4 vetores) apresentam desempenho fraco com elevada variância (erro &gt;5000)</w:t>
+      </w:r>
+    </w:p>
+    <w:p>
+      <w:pPr>
+        <w:pStyle w:val="Normal"/>
+        <w:rPr>
+          <w:b w:val="0"/>
+          <w:bCs w:val="0"/>
+        </w:rPr>
+      </w:pPr>
+      <w:r>
+        <w:rPr>
+          <w:b w:val="0"/>
+          <w:bCs w:val="0"/>
+        </w:rPr>
+        <w:t>Codebooks</w:t>
+      </w:r>
+      <w:r>
+        <w:rPr>
+          <w:b w:val="0"/>
+          <w:bCs w:val="0"/>
+        </w:rPr>
+        <w:t xml:space="preserve"> com 6+ vetores atingem erro quase nulo (</w:t>
+      </w:r>
+      <w:r>
+        <w:rPr>
+          <w:b w:val="0"/>
+          <w:bCs w:val="0"/>
+        </w:rPr>
+        <w:t>overfitting</w:t>
+      </w:r>
+      <w:r>
+        <w:rPr>
+          <w:b w:val="0"/>
+          <w:bCs w:val="0"/>
+        </w:rPr>
+        <w:t xml:space="preserve"> sobre 10 instâncias de treino)</w:t>
+      </w:r>
+    </w:p>
+    <w:p>
+      <w:pPr>
+        <w:pStyle w:val="Normal"/>
+        <w:rPr>
+          <w:b w:val="0"/>
+          <w:bCs w:val="0"/>
+        </w:rPr>
+      </w:pPr>
+      <w:r>
+        <w:rPr>
+          <w:b w:val="0"/>
+          <w:bCs w:val="0"/>
+        </w:rPr>
+        <w:t>Barras de erro grandes para tamanhos pequenos indicam sensibilidade à inicialização aleatória</w:t>
+      </w:r>
+    </w:p>
+    <w:p>
+      <w:pPr>
+        <w:pStyle w:val="Normal"/>
+        <w:rPr>
+          <w:b w:val="0"/>
+          <w:bCs w:val="0"/>
+        </w:rPr>
+      </w:pPr>
+      <w:r>
+        <w:rPr>
+          <w:b w:val="1"/>
+          <w:bCs w:val="1"/>
+        </w:rPr>
+        <w:t>Conclusão prática:</w:t>
+      </w:r>
+      <w:r>
+        <w:rPr>
+          <w:b w:val="0"/>
+          <w:bCs w:val="0"/>
+        </w:rPr>
+        <w:t xml:space="preserve"> Com apenas 10 pontos de dados, 6-8 vetores de </w:t>
+      </w:r>
+      <w:r>
+        <w:rPr>
+          <w:b w:val="0"/>
+          <w:bCs w:val="0"/>
+        </w:rPr>
+        <w:t>codebook</w:t>
+      </w:r>
+      <w:r>
+        <w:rPr>
+          <w:b w:val="0"/>
+          <w:bCs w:val="0"/>
+        </w:rPr>
+        <w:t xml:space="preserve"> são suficientes; mais = memorização e não generalização</w:t>
+      </w:r>
+    </w:p>
+    <w:p>
+      <w:pPr>
+        <w:pStyle w:val="Normal"/>
+        <w:rPr>
+          <w:b w:val="1"/>
+          <w:bCs w:val="1"/>
+        </w:rPr>
       </w:pPr>
     </w:p>
     <w:p>
@@ -518,10 +833,10 @@
       </w:pPr>
       <w:r>
         <w:drawing>
-          <wp:inline wp14:editId="006D8309" wp14:anchorId="012D73C5">
-            <wp:extent cx="5048250" cy="5400675"/>
+          <wp:inline wp14:editId="2957B129" wp14:anchorId="7C1961CA">
+            <wp:extent cx="5400675" cy="3552825"/>
             <wp:effectExtent l="0" t="0" r="0" b="0"/>
-            <wp:docPr id="456518120" name="drawing"/>
+            <wp:docPr id="1177676406" name="drawing"/>
             <wp:cNvGraphicFramePr>
               <a:graphicFrameLocks noChangeAspect="1"/>
             </wp:cNvGraphicFramePr>
@@ -529,11 +844,11 @@
               <a:graphicData xmlns:a="http://schemas.openxmlformats.org/drawingml/2006/main" uri="http://schemas.openxmlformats.org/drawingml/2006/picture">
                 <pic:pic xmlns:pic="http://schemas.openxmlformats.org/drawingml/2006/picture">
                   <pic:nvPicPr>
-                    <pic:cNvPr id="456518120" name="Picture 456518120"/>
+                    <pic:cNvPr id="1177676406" name="Picture 1177676406"/>
                     <pic:cNvPicPr/>
                   </pic:nvPicPr>
                   <pic:blipFill>
-                    <a:blip xmlns:r="http://schemas.openxmlformats.org/officeDocument/2006/relationships" r:embed="rId1313433430">
+                    <a:blip xmlns:r="http://schemas.openxmlformats.org/officeDocument/2006/relationships" r:embed="rId286969088">
                       <a:extLst>
                         <a:ext uri="{28A0092B-C50C-407E-A947-70E740481C1C}">
                           <a14:useLocalDpi xmlns:a14="http://schemas.microsoft.com/office/drawing/2010/main"/>
@@ -547,7 +862,7 @@
                   <pic:spPr>
                     <a:xfrm>
                       <a:off x="0" y="0"/>
-                      <a:ext cx="5048250" cy="5400675"/>
+                      <a:ext cx="5400675" cy="3552825"/>
                     </a:xfrm>
                     <a:prstGeom prst="rect">
                       <a:avLst/>
@@ -563,6 +878,7 @@
     <w:p>
       <w:pPr>
         <w:pStyle w:val="Normal"/>
+        <w:jc w:val="center"/>
       </w:pPr>
       <w:r>
         <w:rPr/>
@@ -574,122 +890,247 @@
       </w:r>
       <w:r>
         <w:rPr/>
-        <w:t xml:space="preserve"> - </w:t>
+        <w:t xml:space="preserve"> </w:t>
       </w:r>
       <w:r>
         <w:rPr/>
-        <w:t xml:space="preserve">100 </w:t>
+        <w:t xml:space="preserve">- </w:t>
       </w:r>
       <w:r>
         <w:rPr/>
-        <w:t>epoch</w:t>
-      </w:r>
+        <w:t>5c_codebook_size_vs_error.png</w:t>
+      </w:r>
+    </w:p>
+    <w:p>
+      <w:pPr>
+        <w:pStyle w:val="Normal"/>
+      </w:pPr>
+    </w:p>
+    <w:p>
+      <w:pPr>
+        <w:pStyle w:val="Normal"/>
+      </w:pPr>
+    </w:p>
+    <w:p>
+      <w:pPr>
+        <w:pStyle w:val="Normal"/>
+      </w:pPr>
+    </w:p>
+    <w:p>
+      <w:pPr>
+        <w:pStyle w:val="Normal"/>
+      </w:pPr>
+    </w:p>
+    <w:p>
+      <w:pPr>
+        <w:pStyle w:val="Normal"/>
+      </w:pPr>
+    </w:p>
+    <w:p>
+      <w:pPr>
+        <w:pStyle w:val="Normal"/>
+      </w:pPr>
+    </w:p>
+    <w:p>
+      <w:pPr>
+        <w:pStyle w:val="Normal"/>
+      </w:pPr>
+    </w:p>
+    <w:p>
+      <w:pPr>
+        <w:pStyle w:val="Normal"/>
+        <w:suppressLineNumbers w:val="0"/>
+        <w:bidi w:val="0"/>
+        <w:spacing w:before="0" w:beforeAutospacing="off" w:after="160" w:afterAutospacing="off" w:line="259" w:lineRule="auto"/>
+        <w:ind w:left="0" w:right="0"/>
+        <w:jc w:val="left"/>
+      </w:pPr>
       <w:r>
         <w:rPr/>
-        <w:t xml:space="preserve"> </w:t>
-      </w:r>
-      <w:r>
-        <w:rPr/>
-        <w:t>with</w:t>
-      </w:r>
-      <w:r>
-        <w:rPr/>
-        <w:t xml:space="preserve"> </w:t>
-      </w:r>
-      <w:r>
-        <w:rPr/>
-        <w:t>learning</w:t>
-      </w:r>
-      <w:r>
-        <w:rPr/>
-        <w:t xml:space="preserve"> rate </w:t>
-      </w:r>
-      <w:r>
-        <w:rPr/>
-        <w:t>of</w:t>
-      </w:r>
-      <w:r>
-        <w:rPr/>
-        <w:t xml:space="preserve"> 0.9</w:t>
-      </w:r>
-    </w:p>
-    <w:p>
-      <w:pPr>
-        <w:pStyle w:val="Normal"/>
-      </w:pPr>
-    </w:p>
-    <w:p>
-      <w:pPr>
-        <w:pStyle w:val="Normal"/>
-      </w:pPr>
-    </w:p>
-    <w:p>
-      <w:pPr>
-        <w:pStyle w:val="Normal"/>
-      </w:pPr>
-    </w:p>
-    <w:p>
-      <w:pPr>
-        <w:pStyle w:val="Normal"/>
-      </w:pPr>
-    </w:p>
-    <w:p>
-      <w:pPr>
-        <w:pStyle w:val="Normal"/>
-      </w:pPr>
-    </w:p>
-    <w:p>
-      <w:pPr>
-        <w:pStyle w:val="Normal"/>
-      </w:pPr>
-    </w:p>
-    <w:p>
-      <w:pPr>
-        <w:pStyle w:val="Normal"/>
-      </w:pPr>
-    </w:p>
-    <w:p>
-      <w:pPr>
-        <w:pStyle w:val="Normal"/>
-      </w:pPr>
-    </w:p>
-    <w:p>
-      <w:pPr>
-        <w:pStyle w:val="Normal"/>
-      </w:pPr>
-    </w:p>
-    <w:p>
-      <w:pPr>
-        <w:pStyle w:val="Normal"/>
-      </w:pPr>
-    </w:p>
-    <w:p>
-      <w:pPr>
-        <w:pStyle w:val="Normal"/>
-      </w:pPr>
-    </w:p>
-    <w:p>
-      <w:pPr>
-        <w:pStyle w:val="Normal"/>
-      </w:pPr>
-      <w:r>
-        <w:rPr/>
-        <w:t>b)</w:t>
-      </w:r>
-      <w:r>
-        <w:rPr/>
-        <w:t xml:space="preserve"> </w:t>
-      </w:r>
-      <w:r>
-        <w:rPr>
-          <w:rFonts w:ascii="Aptos" w:hAnsi="Aptos" w:eastAsia="Aptos" w:cs="Aptos"/>
-          <w:noProof w:val="0"/>
-          <w:sz w:val="22"/>
-          <w:szCs w:val="22"/>
-          <w:lang w:val="pt-PT"/>
-        </w:rPr>
-        <w:t>Increasing the number of epochs reduces the total error quickly at first, and then the improvement slows as the algorithm approaches convergence.</w:t>
-      </w:r>
+        <w:t>5. d)</w:t>
+      </w:r>
+    </w:p>
+    <w:p>
+      <w:pPr>
+        <w:pStyle w:val="Normal"/>
+        <w:suppressLineNumbers w:val="0"/>
+        <w:bidi w:val="0"/>
+        <w:spacing w:before="0" w:beforeAutospacing="off" w:after="160" w:afterAutospacing="off" w:line="259" w:lineRule="auto"/>
+        <w:ind w:left="0" w:right="0"/>
+        <w:jc w:val="left"/>
+        <w:rPr>
+          <w:b w:val="1"/>
+          <w:bCs w:val="1"/>
+        </w:rPr>
+      </w:pPr>
+      <w:r>
+        <w:rPr>
+          <w:b w:val="1"/>
+          <w:bCs w:val="1"/>
+        </w:rPr>
+        <w:t>Observações:</w:t>
+      </w:r>
+    </w:p>
+    <w:p>
+      <w:pPr>
+        <w:pStyle w:val="Normal"/>
+        <w:suppressLineNumbers w:val="0"/>
+        <w:bidi w:val="0"/>
+        <w:spacing w:before="0" w:beforeAutospacing="off" w:after="160" w:afterAutospacing="off" w:line="259" w:lineRule="auto"/>
+        <w:ind w:left="0" w:right="0"/>
+        <w:jc w:val="left"/>
+        <w:rPr>
+          <w:b w:val="0"/>
+          <w:bCs w:val="0"/>
+        </w:rPr>
+      </w:pPr>
+      <w:r>
+        <w:rPr>
+          <w:b w:val="0"/>
+          <w:bCs w:val="0"/>
+        </w:rPr>
+        <w:t>α=0,5 obtém o melhor desempenho (erro=10,825)</w:t>
+      </w:r>
+    </w:p>
+    <w:p>
+      <w:pPr>
+        <w:pStyle w:val="Normal"/>
+        <w:bidi w:val="0"/>
+        <w:spacing w:before="0" w:beforeAutospacing="off" w:after="160" w:afterAutospacing="off" w:line="259" w:lineRule="auto"/>
+        <w:ind w:left="0" w:right="0"/>
+        <w:jc w:val="left"/>
+        <w:rPr>
+          <w:b w:val="0"/>
+          <w:bCs w:val="0"/>
+        </w:rPr>
+      </w:pPr>
+      <w:r>
+        <w:rPr>
+          <w:b w:val="0"/>
+          <w:bCs w:val="0"/>
+        </w:rPr>
+        <w:t xml:space="preserve">Baixo α=0,1: convergência </w:t>
+      </w:r>
+      <w:r>
+        <w:rPr>
+          <w:b w:val="0"/>
+          <w:bCs w:val="0"/>
+        </w:rPr>
+        <w:t>suave</w:t>
+      </w:r>
+      <w:r>
+        <w:rPr>
+          <w:b w:val="0"/>
+          <w:bCs w:val="0"/>
+        </w:rPr>
+        <w:t xml:space="preserve"> mas pode </w:t>
+      </w:r>
+      <w:r>
+        <w:rPr>
+          <w:b w:val="0"/>
+          <w:bCs w:val="0"/>
+        </w:rPr>
+        <w:t>subtrreinar</w:t>
+      </w:r>
+      <w:r>
+        <w:rPr>
+          <w:b w:val="0"/>
+          <w:bCs w:val="0"/>
+        </w:rPr>
+        <w:t xml:space="preserve"> (erro=12,763)</w:t>
+      </w:r>
+    </w:p>
+    <w:p>
+      <w:pPr>
+        <w:pStyle w:val="Normal"/>
+        <w:bidi w:val="0"/>
+        <w:spacing w:before="0" w:beforeAutospacing="off" w:after="160" w:afterAutospacing="off" w:line="259" w:lineRule="auto"/>
+        <w:ind w:left="0" w:right="0"/>
+        <w:jc w:val="left"/>
+        <w:rPr>
+          <w:b w:val="0"/>
+          <w:bCs w:val="0"/>
+        </w:rPr>
+      </w:pPr>
+      <w:r>
+        <w:rPr>
+          <w:b w:val="0"/>
+          <w:bCs w:val="0"/>
+        </w:rPr>
+        <w:t>Alto α=0,9: oscilação excessiva impede a convergência (erro=19,404)</w:t>
+      </w:r>
+    </w:p>
+    <w:p>
+      <w:pPr>
+        <w:pStyle w:val="Normal"/>
+        <w:bidi w:val="0"/>
+        <w:spacing w:before="0" w:beforeAutospacing="off" w:after="160" w:afterAutospacing="off" w:line="259" w:lineRule="auto"/>
+        <w:ind w:left="0" w:right="0"/>
+        <w:jc w:val="left"/>
+        <w:rPr>
+          <w:b w:val="0"/>
+          <w:bCs w:val="0"/>
+        </w:rPr>
+      </w:pPr>
+      <w:r>
+        <w:rPr>
+          <w:b w:val="0"/>
+          <w:bCs w:val="0"/>
+        </w:rPr>
+        <w:t>Taxa de aprendizagem dependente do tempo (como implementado) equilibra exploração inicial com refinamento tardio</w:t>
+      </w:r>
+    </w:p>
+    <w:p>
+      <w:pPr>
+        <w:pStyle w:val="Normal"/>
+        <w:bidi w:val="0"/>
+        <w:spacing w:before="0" w:beforeAutospacing="off" w:after="160" w:afterAutospacing="off" w:line="259" w:lineRule="auto"/>
+        <w:ind w:left="0" w:right="0"/>
+        <w:jc w:val="left"/>
+        <w:rPr>
+          <w:b w:val="0"/>
+          <w:bCs w:val="0"/>
+        </w:rPr>
+      </w:pPr>
+    </w:p>
+    <w:p>
+      <w:pPr>
+        <w:pStyle w:val="Normal"/>
+        <w:bidi w:val="0"/>
+        <w:spacing w:before="0" w:beforeAutospacing="off" w:after="160" w:afterAutospacing="off" w:line="259" w:lineRule="auto"/>
+        <w:ind w:left="0" w:right="0"/>
+        <w:jc w:val="left"/>
+        <w:rPr>
+          <w:b w:val="0"/>
+          <w:bCs w:val="0"/>
+        </w:rPr>
+      </w:pPr>
+      <w:r>
+        <w:rPr>
+          <w:b w:val="1"/>
+          <w:bCs w:val="1"/>
+        </w:rPr>
+        <w:t>Conclusão prática:</w:t>
+      </w:r>
+      <w:r>
+        <w:rPr>
+          <w:b w:val="0"/>
+          <w:bCs w:val="0"/>
+        </w:rPr>
+        <w:t xml:space="preserve"> Taxas de aprendizagem moderadas (0,3-0,5) são ótimas para este </w:t>
+      </w:r>
+      <w:r>
+        <w:rPr>
+          <w:b w:val="0"/>
+          <w:bCs w:val="0"/>
+        </w:rPr>
+        <w:t>dataset</w:t>
+      </w:r>
+    </w:p>
+    <w:p>
+      <w:pPr>
+        <w:pStyle w:val="Normal"/>
+      </w:pPr>
     </w:p>
     <w:p>
       <w:pPr>
@@ -697,10 +1138,10 @@
       </w:pPr>
       <w:r>
         <w:drawing>
-          <wp:inline wp14:editId="76F5AEB3" wp14:anchorId="6E75BE03">
-            <wp:extent cx="4953000" cy="5400675"/>
+          <wp:inline wp14:editId="26C829A2" wp14:anchorId="20485A1F">
+            <wp:extent cx="5400675" cy="3086100"/>
             <wp:effectExtent l="0" t="0" r="0" b="0"/>
-            <wp:docPr id="510897083" name="drawing"/>
+            <wp:docPr id="62682348" name="drawing"/>
             <wp:cNvGraphicFramePr>
               <a:graphicFrameLocks noChangeAspect="1"/>
             </wp:cNvGraphicFramePr>
@@ -708,11 +1149,11 @@
               <a:graphicData xmlns:a="http://schemas.openxmlformats.org/drawingml/2006/main" uri="http://schemas.openxmlformats.org/drawingml/2006/picture">
                 <pic:pic xmlns:pic="http://schemas.openxmlformats.org/drawingml/2006/picture">
                   <pic:nvPicPr>
-                    <pic:cNvPr id="510897083" name="Picture 510897083"/>
+                    <pic:cNvPr id="62682348" name="Picture 62682348"/>
                     <pic:cNvPicPr/>
                   </pic:nvPicPr>
                   <pic:blipFill>
-                    <a:blip xmlns:r="http://schemas.openxmlformats.org/officeDocument/2006/relationships" r:embed="rId657250698">
+                    <a:blip xmlns:r="http://schemas.openxmlformats.org/officeDocument/2006/relationships" r:embed="rId561568553">
                       <a:extLst>
                         <a:ext uri="{28A0092B-C50C-407E-A947-70E740481C1C}">
                           <a14:useLocalDpi xmlns:a14="http://schemas.microsoft.com/office/drawing/2010/main"/>
@@ -726,7 +1167,7 @@
                   <pic:spPr>
                     <a:xfrm>
                       <a:off x="0" y="0"/>
-                      <a:ext cx="4953000" cy="5400675"/>
+                      <a:ext cx="5400675" cy="3086100"/>
                     </a:xfrm>
                     <a:prstGeom prst="rect">
                       <a:avLst/>
@@ -742,18 +1183,15 @@
     <w:p>
       <w:pPr>
         <w:pStyle w:val="Normal"/>
+        <w:jc w:val="center"/>
       </w:pPr>
       <w:r>
         <w:rPr/>
-        <w:t>Figure 3</w:t>
+        <w:t xml:space="preserve">Figure </w:t>
       </w:r>
       <w:r>
         <w:rPr/>
-        <w:t xml:space="preserve"> - </w:t>
-      </w:r>
-      <w:r>
-        <w:rPr/>
-        <w:t>dimCodebook</w:t>
+        <w:t>3</w:t>
       </w:r>
       <w:r>
         <w:rPr/>
@@ -761,677 +1199,57 @@
       </w:r>
       <w:r>
         <w:rPr/>
-        <w:t>value</w:t>
+        <w:t xml:space="preserve">- </w:t>
       </w:r>
       <w:r>
         <w:rPr/>
-        <w:t xml:space="preserve"> 1</w:t>
-      </w:r>
-    </w:p>
-    <w:p>
-      <w:pPr>
-        <w:pStyle w:val="Normal"/>
-      </w:pPr>
-    </w:p>
-    <w:p>
-      <w:pPr>
-        <w:pStyle w:val="Normal"/>
-      </w:pPr>
-      <w:r>
-        <w:drawing>
-          <wp:inline wp14:editId="468D2DCF" wp14:anchorId="0965527B">
-            <wp:extent cx="4762500" cy="5400675"/>
-            <wp:effectExtent l="0" t="0" r="0" b="0"/>
-            <wp:docPr id="1676185790" name="drawing"/>
-            <wp:cNvGraphicFramePr>
-              <a:graphicFrameLocks noChangeAspect="1"/>
-            </wp:cNvGraphicFramePr>
-            <a:graphic>
-              <a:graphicData xmlns:a="http://schemas.openxmlformats.org/drawingml/2006/main" uri="http://schemas.openxmlformats.org/drawingml/2006/picture">
-                <pic:pic xmlns:pic="http://schemas.openxmlformats.org/drawingml/2006/picture">
-                  <pic:nvPicPr>
-                    <pic:cNvPr id="1676185790" name="Picture 1676185790"/>
-                    <pic:cNvPicPr/>
-                  </pic:nvPicPr>
-                  <pic:blipFill>
-                    <a:blip xmlns:r="http://schemas.openxmlformats.org/officeDocument/2006/relationships" r:embed="rId1964205848">
-                      <a:extLst>
-                        <a:ext uri="{28A0092B-C50C-407E-A947-70E740481C1C}">
-                          <a14:useLocalDpi xmlns:a14="http://schemas.microsoft.com/office/drawing/2010/main"/>
-                        </a:ext>
-                      </a:extLst>
-                    </a:blip>
-                    <a:stretch>
-                      <a:fillRect/>
-                    </a:stretch>
-                  </pic:blipFill>
-                  <pic:spPr>
-                    <a:xfrm>
-                      <a:off x="0" y="0"/>
-                      <a:ext cx="4762500" cy="5400675"/>
-                    </a:xfrm>
-                    <a:prstGeom prst="rect">
-                      <a:avLst/>
-                    </a:prstGeom>
-                  </pic:spPr>
-                </pic:pic>
-              </a:graphicData>
-            </a:graphic>
-          </wp:inline>
-        </w:drawing>
-      </w:r>
-    </w:p>
-    <w:p>
-      <w:pPr>
-        <w:pStyle w:val="Normal"/>
-      </w:pPr>
-      <w:r>
-        <w:rPr/>
-        <w:t>Figure 4</w:t>
-      </w:r>
-      <w:r>
-        <w:rPr/>
-        <w:t xml:space="preserve"> - </w:t>
-      </w:r>
-      <w:r>
-        <w:rPr/>
-        <w:t>dimCodebook</w:t>
-      </w:r>
-      <w:r>
-        <w:rPr/>
-        <w:t xml:space="preserve"> </w:t>
-      </w:r>
-      <w:r>
-        <w:rPr/>
-        <w:t>value</w:t>
-      </w:r>
-      <w:r>
-        <w:rPr/>
-        <w:t xml:space="preserve"> 5</w:t>
-      </w:r>
-    </w:p>
-    <w:p>
-      <w:pPr>
-        <w:pStyle w:val="Normal"/>
-      </w:pPr>
-    </w:p>
-    <w:p>
-      <w:pPr>
-        <w:pStyle w:val="Normal"/>
-      </w:pPr>
-      <w:r>
-        <w:drawing>
-          <wp:inline wp14:editId="2A96CA5C" wp14:anchorId="40C83796">
-            <wp:extent cx="4800600" cy="5400675"/>
-            <wp:effectExtent l="0" t="0" r="0" b="0"/>
-            <wp:docPr id="372967684" name="drawing"/>
-            <wp:cNvGraphicFramePr>
-              <a:graphicFrameLocks noChangeAspect="1"/>
-            </wp:cNvGraphicFramePr>
-            <a:graphic>
-              <a:graphicData xmlns:a="http://schemas.openxmlformats.org/drawingml/2006/main" uri="http://schemas.openxmlformats.org/drawingml/2006/picture">
-                <pic:pic xmlns:pic="http://schemas.openxmlformats.org/drawingml/2006/picture">
-                  <pic:nvPicPr>
-                    <pic:cNvPr id="372967684" name="Picture 372967684"/>
-                    <pic:cNvPicPr/>
-                  </pic:nvPicPr>
-                  <pic:blipFill>
-                    <a:blip xmlns:r="http://schemas.openxmlformats.org/officeDocument/2006/relationships" r:embed="rId1444970984">
-                      <a:extLst>
-                        <a:ext uri="{28A0092B-C50C-407E-A947-70E740481C1C}">
-                          <a14:useLocalDpi xmlns:a14="http://schemas.microsoft.com/office/drawing/2010/main"/>
-                        </a:ext>
-                      </a:extLst>
-                    </a:blip>
-                    <a:stretch>
-                      <a:fillRect/>
-                    </a:stretch>
-                  </pic:blipFill>
-                  <pic:spPr>
-                    <a:xfrm>
-                      <a:off x="0" y="0"/>
-                      <a:ext cx="4800600" cy="5400675"/>
-                    </a:xfrm>
-                    <a:prstGeom prst="rect">
-                      <a:avLst/>
-                    </a:prstGeom>
-                  </pic:spPr>
-                </pic:pic>
-              </a:graphicData>
-            </a:graphic>
-          </wp:inline>
-        </w:drawing>
-      </w:r>
-    </w:p>
-    <w:p>
-      <w:pPr>
-        <w:pStyle w:val="Normal"/>
-      </w:pPr>
-      <w:r>
-        <w:rPr/>
-        <w:t>Figure 5</w:t>
-      </w:r>
-      <w:r>
-        <w:rPr/>
-        <w:t xml:space="preserve"> - </w:t>
-      </w:r>
-      <w:r>
-        <w:rPr/>
-        <w:t>dim</w:t>
-      </w:r>
-      <w:r>
-        <w:rPr/>
-        <w:t>Codebook</w:t>
-      </w:r>
-      <w:r>
-        <w:rPr/>
-        <w:t xml:space="preserve"> </w:t>
-      </w:r>
-      <w:r>
-        <w:rPr/>
-        <w:t>value</w:t>
-      </w:r>
-      <w:r>
-        <w:rPr/>
-        <w:t xml:space="preserve"> 10</w:t>
-      </w:r>
-    </w:p>
-    <w:p>
-      <w:pPr>
-        <w:pStyle w:val="Normal"/>
-      </w:pPr>
-    </w:p>
-    <w:p>
-      <w:pPr>
-        <w:pStyle w:val="Normal"/>
-      </w:pPr>
-    </w:p>
-    <w:p>
-      <w:pPr>
-        <w:pStyle w:val="Normal"/>
-      </w:pPr>
-    </w:p>
-    <w:p>
-      <w:pPr>
-        <w:pStyle w:val="Normal"/>
-      </w:pPr>
-    </w:p>
-    <w:p>
-      <w:pPr>
-        <w:pStyle w:val="Normal"/>
-      </w:pPr>
-    </w:p>
-    <w:p>
-      <w:pPr>
-        <w:pStyle w:val="Normal"/>
-      </w:pPr>
-    </w:p>
-    <w:p>
-      <w:pPr>
-        <w:pStyle w:val="Normal"/>
-      </w:pPr>
-    </w:p>
-    <w:p>
-      <w:pPr>
-        <w:pStyle w:val="Normal"/>
-      </w:pPr>
-    </w:p>
-    <w:p>
-      <w:pPr>
-        <w:pStyle w:val="Normal"/>
-      </w:pPr>
-    </w:p>
-    <w:p>
-      <w:pPr>
-        <w:pStyle w:val="Normal"/>
-      </w:pPr>
-    </w:p>
-    <w:p>
-      <w:pPr>
-        <w:pStyle w:val="Normal"/>
-      </w:pPr>
-    </w:p>
-    <w:p>
-      <w:pPr>
-        <w:pStyle w:val="Normal"/>
-      </w:pPr>
-      <w:r>
-        <w:rPr/>
-        <w:t xml:space="preserve">c) </w:t>
-      </w:r>
-      <w:r>
-        <w:rPr>
-          <w:rFonts w:ascii="Aptos" w:hAnsi="Aptos" w:eastAsia="Aptos" w:cs="Aptos"/>
-          <w:noProof w:val="0"/>
-          <w:sz w:val="22"/>
-          <w:szCs w:val="22"/>
-          <w:lang w:val="pt-PT"/>
-        </w:rPr>
-        <w:t xml:space="preserve">More epochs reduce the total error, with faster reductions at the beginning. </w:t>
-      </w:r>
-    </w:p>
-    <w:p>
-      <w:pPr>
-        <w:pStyle w:val="Normal"/>
-      </w:pPr>
-      <w:r>
-        <w:drawing>
-          <wp:inline wp14:editId="4743CB0A" wp14:anchorId="607A7909">
-            <wp:extent cx="4838700" cy="5400675"/>
-            <wp:effectExtent l="0" t="0" r="0" b="0"/>
-            <wp:docPr id="468967978" name="drawing"/>
-            <wp:cNvGraphicFramePr>
-              <a:graphicFrameLocks noChangeAspect="1"/>
-            </wp:cNvGraphicFramePr>
-            <a:graphic>
-              <a:graphicData xmlns:a="http://schemas.openxmlformats.org/drawingml/2006/main" uri="http://schemas.openxmlformats.org/drawingml/2006/picture">
-                <pic:pic xmlns:pic="http://schemas.openxmlformats.org/drawingml/2006/picture">
-                  <pic:nvPicPr>
-                    <pic:cNvPr id="468967978" name="Picture 468967978"/>
-                    <pic:cNvPicPr/>
-                  </pic:nvPicPr>
-                  <pic:blipFill>
-                    <a:blip xmlns:r="http://schemas.openxmlformats.org/officeDocument/2006/relationships" r:embed="rId95331904">
-                      <a:extLst>
-                        <a:ext uri="{28A0092B-C50C-407E-A947-70E740481C1C}">
-                          <a14:useLocalDpi xmlns:a14="http://schemas.microsoft.com/office/drawing/2010/main"/>
-                        </a:ext>
-                      </a:extLst>
-                    </a:blip>
-                    <a:stretch>
-                      <a:fillRect/>
-                    </a:stretch>
-                  </pic:blipFill>
-                  <pic:spPr>
-                    <a:xfrm>
-                      <a:off x="0" y="0"/>
-                      <a:ext cx="4838700" cy="5400675"/>
-                    </a:xfrm>
-                    <a:prstGeom prst="rect">
-                      <a:avLst/>
-                    </a:prstGeom>
-                  </pic:spPr>
-                </pic:pic>
-              </a:graphicData>
-            </a:graphic>
-          </wp:inline>
-        </w:drawing>
-      </w:r>
-    </w:p>
-    <w:p>
-      <w:pPr>
-        <w:pStyle w:val="Normal"/>
-      </w:pPr>
-      <w:r>
-        <w:rPr/>
-        <w:t>Figure 6</w:t>
-      </w:r>
-      <w:r>
-        <w:rPr/>
-        <w:t xml:space="preserve"> - l</w:t>
-      </w:r>
-      <w:r>
-        <w:rPr/>
-        <w:t xml:space="preserve">ow rate </w:t>
-      </w:r>
-      <w:r>
-        <w:rPr/>
-        <w:t>of</w:t>
-      </w:r>
-      <w:r>
-        <w:rPr/>
-        <w:t xml:space="preserve"> </w:t>
-      </w:r>
-      <w:r>
-        <w:rPr/>
-        <w:t>epochs</w:t>
-      </w:r>
-    </w:p>
-    <w:p>
-      <w:pPr>
-        <w:pStyle w:val="Normal"/>
-      </w:pPr>
-    </w:p>
-    <w:p>
-      <w:pPr>
-        <w:pStyle w:val="Normal"/>
-      </w:pPr>
-    </w:p>
-    <w:p>
-      <w:pPr>
-        <w:pStyle w:val="Normal"/>
-      </w:pPr>
-    </w:p>
-    <w:p>
-      <w:pPr>
-        <w:pStyle w:val="Normal"/>
-      </w:pPr>
-    </w:p>
-    <w:p>
-      <w:pPr>
-        <w:pStyle w:val="Normal"/>
-      </w:pPr>
-    </w:p>
-    <w:p>
-      <w:pPr>
-        <w:pStyle w:val="Normal"/>
-      </w:pPr>
-    </w:p>
-    <w:p>
-      <w:pPr>
-        <w:pStyle w:val="Normal"/>
-      </w:pPr>
-    </w:p>
-    <w:p>
-      <w:pPr>
-        <w:pStyle w:val="Normal"/>
-      </w:pPr>
-    </w:p>
-    <w:p>
-      <w:pPr>
-        <w:pStyle w:val="Normal"/>
-      </w:pPr>
-    </w:p>
-    <w:p>
-      <w:pPr>
-        <w:pStyle w:val="Normal"/>
-      </w:pPr>
-    </w:p>
-    <w:p>
-      <w:pPr>
-        <w:pStyle w:val="Normal"/>
-      </w:pPr>
-    </w:p>
-    <w:p>
-      <w:pPr>
-        <w:pStyle w:val="Normal"/>
-      </w:pPr>
-      <w:r>
-        <w:rPr>
-          <w:rFonts w:ascii="Aptos" w:hAnsi="Aptos" w:eastAsia="Aptos" w:cs="Aptos"/>
-          <w:noProof w:val="0"/>
-          <w:sz w:val="22"/>
-          <w:szCs w:val="22"/>
-          <w:lang w:val="pt-PT"/>
-        </w:rPr>
-        <w:t>Increasing</w:t>
-      </w:r>
-      <w:r>
-        <w:rPr>
-          <w:rFonts w:ascii="Aptos" w:hAnsi="Aptos" w:eastAsia="Aptos" w:cs="Aptos"/>
-          <w:noProof w:val="0"/>
-          <w:sz w:val="22"/>
-          <w:szCs w:val="22"/>
-          <w:lang w:val="pt-PT"/>
-        </w:rPr>
-        <w:t xml:space="preserve"> </w:t>
-      </w:r>
-      <w:r>
-        <w:rPr>
-          <w:rFonts w:ascii="Aptos" w:hAnsi="Aptos" w:eastAsia="Aptos" w:cs="Aptos"/>
-          <w:noProof w:val="0"/>
-          <w:sz w:val="22"/>
-          <w:szCs w:val="22"/>
-          <w:lang w:val="pt-PT"/>
-        </w:rPr>
-        <w:t>the</w:t>
-      </w:r>
-      <w:r>
-        <w:rPr>
-          <w:rFonts w:ascii="Aptos" w:hAnsi="Aptos" w:eastAsia="Aptos" w:cs="Aptos"/>
-          <w:noProof w:val="0"/>
-          <w:sz w:val="22"/>
-          <w:szCs w:val="22"/>
-          <w:lang w:val="pt-PT"/>
-        </w:rPr>
-        <w:t xml:space="preserve"> </w:t>
-      </w:r>
-      <w:r>
-        <w:rPr>
-          <w:rFonts w:ascii="Aptos" w:hAnsi="Aptos" w:eastAsia="Aptos" w:cs="Aptos"/>
-          <w:noProof w:val="0"/>
-          <w:sz w:val="22"/>
-          <w:szCs w:val="22"/>
-          <w:lang w:val="pt-PT"/>
-        </w:rPr>
-        <w:t>codebook</w:t>
-      </w:r>
-      <w:r>
-        <w:rPr>
-          <w:rFonts w:ascii="Aptos" w:hAnsi="Aptos" w:eastAsia="Aptos" w:cs="Aptos"/>
-          <w:noProof w:val="0"/>
-          <w:sz w:val="22"/>
-          <w:szCs w:val="22"/>
-          <w:lang w:val="pt-PT"/>
-        </w:rPr>
-        <w:t xml:space="preserve"> </w:t>
-      </w:r>
-      <w:r>
-        <w:rPr>
-          <w:rFonts w:ascii="Aptos" w:hAnsi="Aptos" w:eastAsia="Aptos" w:cs="Aptos"/>
-          <w:noProof w:val="0"/>
-          <w:sz w:val="22"/>
-          <w:szCs w:val="22"/>
-          <w:lang w:val="pt-PT"/>
-        </w:rPr>
-        <w:t>size</w:t>
-      </w:r>
-      <w:r>
-        <w:rPr>
-          <w:rFonts w:ascii="Aptos" w:hAnsi="Aptos" w:eastAsia="Aptos" w:cs="Aptos"/>
-          <w:noProof w:val="0"/>
-          <w:sz w:val="22"/>
-          <w:szCs w:val="22"/>
-          <w:lang w:val="pt-PT"/>
-        </w:rPr>
-        <w:t xml:space="preserve"> </w:t>
-      </w:r>
-      <w:r>
-        <w:rPr>
-          <w:rFonts w:ascii="Aptos" w:hAnsi="Aptos" w:eastAsia="Aptos" w:cs="Aptos"/>
-          <w:noProof w:val="0"/>
-          <w:sz w:val="22"/>
-          <w:szCs w:val="22"/>
-          <w:lang w:val="pt-PT"/>
-        </w:rPr>
-        <w:t>lowers</w:t>
-      </w:r>
-      <w:r>
-        <w:rPr>
-          <w:rFonts w:ascii="Aptos" w:hAnsi="Aptos" w:eastAsia="Aptos" w:cs="Aptos"/>
-          <w:noProof w:val="0"/>
-          <w:sz w:val="22"/>
-          <w:szCs w:val="22"/>
-          <w:lang w:val="pt-PT"/>
-        </w:rPr>
-        <w:t xml:space="preserve"> error, </w:t>
-      </w:r>
-      <w:r>
-        <w:rPr>
-          <w:rFonts w:ascii="Aptos" w:hAnsi="Aptos" w:eastAsia="Aptos" w:cs="Aptos"/>
-          <w:noProof w:val="0"/>
-          <w:sz w:val="22"/>
-          <w:szCs w:val="22"/>
-          <w:lang w:val="pt-PT"/>
-        </w:rPr>
-        <w:t>but</w:t>
-      </w:r>
-      <w:r>
-        <w:rPr>
-          <w:rFonts w:ascii="Aptos" w:hAnsi="Aptos" w:eastAsia="Aptos" w:cs="Aptos"/>
-          <w:noProof w:val="0"/>
-          <w:sz w:val="22"/>
-          <w:szCs w:val="22"/>
-          <w:lang w:val="pt-PT"/>
-        </w:rPr>
-        <w:t xml:space="preserve"> </w:t>
-      </w:r>
-      <w:r>
-        <w:rPr>
-          <w:rFonts w:ascii="Aptos" w:hAnsi="Aptos" w:eastAsia="Aptos" w:cs="Aptos"/>
-          <w:noProof w:val="0"/>
-          <w:sz w:val="22"/>
-          <w:szCs w:val="22"/>
-          <w:lang w:val="pt-PT"/>
-        </w:rPr>
-        <w:t>gains</w:t>
-      </w:r>
-      <w:r>
-        <w:rPr>
-          <w:rFonts w:ascii="Aptos" w:hAnsi="Aptos" w:eastAsia="Aptos" w:cs="Aptos"/>
-          <w:noProof w:val="0"/>
-          <w:sz w:val="22"/>
-          <w:szCs w:val="22"/>
-          <w:lang w:val="pt-PT"/>
-        </w:rPr>
-        <w:t xml:space="preserve"> </w:t>
-      </w:r>
-      <w:r>
-        <w:rPr>
-          <w:rFonts w:ascii="Aptos" w:hAnsi="Aptos" w:eastAsia="Aptos" w:cs="Aptos"/>
-          <w:noProof w:val="0"/>
-          <w:sz w:val="22"/>
-          <w:szCs w:val="22"/>
-          <w:lang w:val="pt-PT"/>
-        </w:rPr>
-        <w:t>diminish</w:t>
-      </w:r>
-      <w:r>
-        <w:rPr>
-          <w:rFonts w:ascii="Aptos" w:hAnsi="Aptos" w:eastAsia="Aptos" w:cs="Aptos"/>
-          <w:noProof w:val="0"/>
-          <w:sz w:val="22"/>
-          <w:szCs w:val="22"/>
-          <w:lang w:val="pt-PT"/>
-        </w:rPr>
-        <w:t xml:space="preserve"> </w:t>
-      </w:r>
-      <w:r>
-        <w:rPr>
-          <w:rFonts w:ascii="Aptos" w:hAnsi="Aptos" w:eastAsia="Aptos" w:cs="Aptos"/>
-          <w:noProof w:val="0"/>
-          <w:sz w:val="22"/>
-          <w:szCs w:val="22"/>
-          <w:lang w:val="pt-PT"/>
-        </w:rPr>
-        <w:t>with</w:t>
-      </w:r>
-      <w:r>
-        <w:rPr>
-          <w:rFonts w:ascii="Aptos" w:hAnsi="Aptos" w:eastAsia="Aptos" w:cs="Aptos"/>
-          <w:noProof w:val="0"/>
-          <w:sz w:val="22"/>
-          <w:szCs w:val="22"/>
-          <w:lang w:val="pt-PT"/>
-        </w:rPr>
-        <w:t xml:space="preserve"> more </w:t>
-      </w:r>
-      <w:r>
-        <w:rPr>
-          <w:rFonts w:ascii="Aptos" w:hAnsi="Aptos" w:eastAsia="Aptos" w:cs="Aptos"/>
-          <w:noProof w:val="0"/>
-          <w:sz w:val="22"/>
-          <w:szCs w:val="22"/>
-          <w:lang w:val="pt-PT"/>
-        </w:rPr>
-        <w:t>prototypes</w:t>
-      </w:r>
-      <w:r>
-        <w:rPr>
-          <w:rFonts w:ascii="Aptos" w:hAnsi="Aptos" w:eastAsia="Aptos" w:cs="Aptos"/>
-          <w:noProof w:val="0"/>
-          <w:sz w:val="22"/>
-          <w:szCs w:val="22"/>
-          <w:lang w:val="pt-PT"/>
-        </w:rPr>
-        <w:t>.</w:t>
-      </w:r>
-    </w:p>
-    <w:p>
-      <w:pPr>
-        <w:pStyle w:val="Normal"/>
-      </w:pPr>
-      <w:r>
-        <w:drawing>
-          <wp:inline wp14:editId="1AAF2CCE" wp14:anchorId="6975338A">
-            <wp:extent cx="4781550" cy="5400675"/>
-            <wp:effectExtent l="0" t="0" r="0" b="0"/>
-            <wp:docPr id="736898289" name="drawing"/>
-            <wp:cNvGraphicFramePr>
-              <a:graphicFrameLocks noChangeAspect="1"/>
-            </wp:cNvGraphicFramePr>
-            <a:graphic>
-              <a:graphicData xmlns:a="http://schemas.openxmlformats.org/drawingml/2006/main" uri="http://schemas.openxmlformats.org/drawingml/2006/picture">
-                <pic:pic xmlns:pic="http://schemas.openxmlformats.org/drawingml/2006/picture">
-                  <pic:nvPicPr>
-                    <pic:cNvPr id="736898289" name="Picture 736898289"/>
-                    <pic:cNvPicPr/>
-                  </pic:nvPicPr>
-                  <pic:blipFill>
-                    <a:blip xmlns:r="http://schemas.openxmlformats.org/officeDocument/2006/relationships" r:embed="rId233296669">
-                      <a:extLst>
-                        <a:ext uri="{28A0092B-C50C-407E-A947-70E740481C1C}">
-                          <a14:useLocalDpi xmlns:a14="http://schemas.microsoft.com/office/drawing/2010/main"/>
-                        </a:ext>
-                      </a:extLst>
-                    </a:blip>
-                    <a:stretch>
-                      <a:fillRect/>
-                    </a:stretch>
-                  </pic:blipFill>
-                  <pic:spPr>
-                    <a:xfrm>
-                      <a:off x="0" y="0"/>
-                      <a:ext cx="4781550" cy="5400675"/>
-                    </a:xfrm>
-                    <a:prstGeom prst="rect">
-                      <a:avLst/>
-                    </a:prstGeom>
-                  </pic:spPr>
-                </pic:pic>
-              </a:graphicData>
-            </a:graphic>
-          </wp:inline>
-        </w:drawing>
-      </w:r>
-    </w:p>
-    <w:p>
-      <w:pPr>
-        <w:pStyle w:val="Normal"/>
-        <w:rPr>
-          <w:lang w:val="en-US"/>
-        </w:rPr>
-      </w:pPr>
-      <w:r>
-        <w:rPr>
-          <w:lang w:val="en-US"/>
-        </w:rPr>
-        <w:t>Figure 7</w:t>
-      </w:r>
-      <w:r>
-        <w:rPr>
-          <w:lang w:val="en-US"/>
-        </w:rPr>
-        <w:t xml:space="preserve"> - l</w:t>
-      </w:r>
-      <w:r>
-        <w:rPr>
-          <w:lang w:val="en-US"/>
-        </w:rPr>
-        <w:t xml:space="preserve">ower error rate with </w:t>
-      </w:r>
-      <w:r>
-        <w:rPr>
-          <w:lang w:val="en-US"/>
-        </w:rPr>
-        <w:t>dimCodebook</w:t>
-      </w:r>
-      <w:r>
-        <w:rPr>
-          <w:lang w:val="en-US"/>
-        </w:rPr>
-        <w:t xml:space="preserve"> increased</w:t>
-      </w:r>
+        <w:t>5d_learning_rate_comparison.png</w:t>
+      </w:r>
+    </w:p>
+    <w:p>
+      <w:pPr>
+        <w:pStyle w:val="Normal"/>
+      </w:pPr>
+    </w:p>
+    <w:p>
+      <w:pPr>
+        <w:pStyle w:val="Normal"/>
+      </w:pPr>
+    </w:p>
+    <w:p>
+      <w:pPr>
+        <w:pStyle w:val="Normal"/>
+      </w:pPr>
+    </w:p>
+    <w:p>
+      <w:pPr>
+        <w:pStyle w:val="Normal"/>
+      </w:pPr>
+    </w:p>
+    <w:p>
+      <w:pPr>
+        <w:pStyle w:val="Normal"/>
+      </w:pPr>
+    </w:p>
+    <w:p>
+      <w:pPr>
+        <w:pStyle w:val="Normal"/>
+      </w:pPr>
+    </w:p>
+    <w:p>
+      <w:pPr>
+        <w:pStyle w:val="Normal"/>
+      </w:pPr>
+    </w:p>
+    <w:p>
+      <w:pPr>
+        <w:pStyle w:val="Normal"/>
+      </w:pPr>
+    </w:p>
+    <w:p>
+      <w:pPr>
+        <w:pStyle w:val="Normal"/>
+      </w:pPr>
     </w:p>
     <w:sectPr>
       <w:headerReference w:type="default" r:id="rId20"/>
@@ -1560,13 +1378,25 @@
       <w:rPr>
         <w:rFonts w:ascii="Times New Roman" w:hAnsi="Times New Roman" w:cs="Times New Roman"/>
       </w:rPr>
-      <w:t xml:space="preserve">Segunda-feira, </w:t>
+      <w:t>Domingo</w:t>
     </w:r>
     <w:r>
       <w:rPr>
         <w:rFonts w:ascii="Times New Roman" w:hAnsi="Times New Roman" w:cs="Times New Roman"/>
       </w:rPr>
-      <w:t>08</w:t>
+      <w:t xml:space="preserve">, </w:t>
+    </w:r>
+    <w:r>
+      <w:rPr>
+        <w:rFonts w:ascii="Times New Roman" w:hAnsi="Times New Roman" w:cs="Times New Roman"/>
+      </w:rPr>
+      <w:t>2</w:t>
+    </w:r>
+    <w:r>
+      <w:rPr>
+        <w:rFonts w:ascii="Times New Roman" w:hAnsi="Times New Roman" w:cs="Times New Roman"/>
+      </w:rPr>
+      <w:t>8</w:t>
     </w:r>
     <w:r>
       <w:rPr>
@@ -1641,13 +1471,37 @@
       <w:rPr>
         <w:rFonts w:ascii="Times New Roman" w:hAnsi="Times New Roman" w:cs="Times New Roman"/>
       </w:rPr>
-      <w:t>Module of Pratice #0</w:t>
+      <w:t xml:space="preserve">Module </w:t>
     </w:r>
     <w:r>
       <w:rPr>
         <w:rFonts w:ascii="Times New Roman" w:hAnsi="Times New Roman" w:cs="Times New Roman"/>
       </w:rPr>
-      <w:t>4</w:t>
+      <w:t>of</w:t>
+    </w:r>
+    <w:r>
+      <w:rPr>
+        <w:rFonts w:ascii="Times New Roman" w:hAnsi="Times New Roman" w:cs="Times New Roman"/>
+      </w:rPr>
+      <w:t xml:space="preserve"> </w:t>
+    </w:r>
+    <w:r>
+      <w:rPr>
+        <w:rFonts w:ascii="Times New Roman" w:hAnsi="Times New Roman" w:cs="Times New Roman"/>
+      </w:rPr>
+      <w:t>Pratice</w:t>
+    </w:r>
+    <w:r>
+      <w:rPr>
+        <w:rFonts w:ascii="Times New Roman" w:hAnsi="Times New Roman" w:cs="Times New Roman"/>
+      </w:rPr>
+      <w:t xml:space="preserve"> #0</w:t>
+    </w:r>
+    <w:r>
+      <w:rPr>
+        <w:rFonts w:ascii="Times New Roman" w:hAnsi="Times New Roman" w:cs="Times New Roman"/>
+      </w:rPr>
+      <w:t>8</w:t>
     </w:r>
   </w:p>
 </w:hdr>
@@ -1746,6 +1600,118 @@
 
 <file path=word/numbering.xml><?xml version="1.0" encoding="utf-8"?>
 <w:numbering xmlns:wpc="http://schemas.microsoft.com/office/word/2010/wordprocessingCanvas" xmlns:cx="http://schemas.microsoft.com/office/drawing/2014/chartex" xmlns:cx1="http://schemas.microsoft.com/office/drawing/2015/9/8/chartex" xmlns:cx2="http://schemas.microsoft.com/office/drawing/2015/10/21/chartex" xmlns:cx3="http://schemas.microsoft.com/office/drawing/2016/5/9/chartex" xmlns:cx4="http://schemas.microsoft.com/office/drawing/2016/5/10/chartex" xmlns:cx5="http://schemas.microsoft.com/office/drawing/2016/5/11/chartex" xmlns:cx6="http://schemas.microsoft.com/office/drawing/2016/5/12/chartex" xmlns:cx7="http://schemas.microsoft.com/office/drawing/2016/5/13/chartex" xmlns:cx8="http://schemas.microsoft.com/office/drawing/2016/5/14/chartex" xmlns:mc="http://schemas.openxmlformats.org/markup-compatibility/2006" xmlns:aink="http://schemas.microsoft.com/office/drawing/2016/ink" xmlns:am3d="http://schemas.microsoft.com/office/drawing/2017/model3d" xmlns:o="urn:schemas-microsoft-com:office:office" xmlns:oel="http://schemas.microsoft.com/office/2019/extlst" xmlns:r="http://schemas.openxmlformats.org/officeDocument/2006/relationships" xmlns:m="http://schemas.openxmlformats.org/officeDocument/2006/math" xmlns:v="urn:schemas-microsoft-com:vml" xmlns:wp14="http://schemas.microsoft.com/office/word/2010/wordprocessingDrawing" xmlns:wp="http://schemas.openxmlformats.org/drawingml/2006/wordprocessingDrawing" xmlns:w10="urn:schemas-microsoft-com:office:word" xmlns:w="http://schemas.openxmlformats.org/wordprocessingml/2006/main" xmlns:w14="http://schemas.microsoft.com/office/word/2010/wordml" xmlns:w15="http://schemas.microsoft.com/office/word/2012/wordml" xmlns:w16cex="http://schemas.microsoft.com/office/word/2018/wordml/cex" xmlns:w16cid="http://schemas.microsoft.com/office/word/2016/wordml/cid" xmlns:w16="http://schemas.microsoft.com/office/word/2018/wordml" xmlns:w16du="http://schemas.microsoft.com/office/word/2023/wordml/word16du" xmlns:w16sdtdh="http://schemas.microsoft.com/office/word/2020/wordml/sdtdatahash" xmlns:w16sdtfl="http://schemas.microsoft.com/office/word/2024/wordml/sdtformatlock" xmlns:w16se="http://schemas.microsoft.com/office/word/2015/wordml/symex" xmlns:wpg="http://schemas.microsoft.com/office/word/2010/wordprocessingGroup" xmlns:wpi="http://schemas.microsoft.com/office/word/2010/wordprocessingInk" xmlns:wne="http://schemas.microsoft.com/office/word/2006/wordml" xmlns:wps="http://schemas.microsoft.com/office/word/2010/wordprocessingShape" mc:Ignorable="w14 w15 w16se w16cid w16 w16cex w16sdtdh w16sdtfl w16du wp14">
+  <w:abstractNum xmlns:w="http://schemas.openxmlformats.org/wordprocessingml/2006/main" w:abstractNumId="1">
+    <w:nsid w:val="5200be25"/>
+    <w:multiLevelType xmlns:w="http://schemas.openxmlformats.org/wordprocessingml/2006/main" w:val="hybridMultilevel"/>
+    <w:lvl xmlns:w="http://schemas.openxmlformats.org/wordprocessingml/2006/main" w:ilvl="0">
+      <w:start w:val="1"/>
+      <w:numFmt w:val="bullet"/>
+      <w:lvlText w:val=""/>
+      <w:lvlJc w:val="left"/>
+      <w:pPr>
+        <w:ind w:left="720" w:hanging="360"/>
+      </w:pPr>
+      <w:rPr>
+        <w:rFonts w:hint="default" w:ascii="Symbol" w:hAnsi="Symbol"/>
+      </w:rPr>
+    </w:lvl>
+    <w:lvl xmlns:w="http://schemas.openxmlformats.org/wordprocessingml/2006/main" w:ilvl="1">
+      <w:start w:val="1"/>
+      <w:numFmt w:val="bullet"/>
+      <w:lvlText w:val="o"/>
+      <w:lvlJc w:val="left"/>
+      <w:pPr>
+        <w:ind w:left="1440" w:hanging="360"/>
+      </w:pPr>
+      <w:rPr>
+        <w:rFonts w:hint="default" w:ascii="Courier New" w:hAnsi="Courier New"/>
+      </w:rPr>
+    </w:lvl>
+    <w:lvl xmlns:w="http://schemas.openxmlformats.org/wordprocessingml/2006/main" w:ilvl="2">
+      <w:start w:val="1"/>
+      <w:numFmt w:val="bullet"/>
+      <w:lvlText w:val=""/>
+      <w:lvlJc w:val="left"/>
+      <w:pPr>
+        <w:ind w:left="2160" w:hanging="360"/>
+      </w:pPr>
+      <w:rPr>
+        <w:rFonts w:hint="default" w:ascii="Wingdings" w:hAnsi="Wingdings"/>
+      </w:rPr>
+    </w:lvl>
+    <w:lvl xmlns:w="http://schemas.openxmlformats.org/wordprocessingml/2006/main" w:ilvl="3">
+      <w:start w:val="1"/>
+      <w:numFmt w:val="bullet"/>
+      <w:lvlText w:val=""/>
+      <w:lvlJc w:val="left"/>
+      <w:pPr>
+        <w:ind w:left="2880" w:hanging="360"/>
+      </w:pPr>
+      <w:rPr>
+        <w:rFonts w:hint="default" w:ascii="Symbol" w:hAnsi="Symbol"/>
+      </w:rPr>
+    </w:lvl>
+    <w:lvl xmlns:w="http://schemas.openxmlformats.org/wordprocessingml/2006/main" w:ilvl="4">
+      <w:start w:val="1"/>
+      <w:numFmt w:val="bullet"/>
+      <w:lvlText w:val="o"/>
+      <w:lvlJc w:val="left"/>
+      <w:pPr>
+        <w:ind w:left="3600" w:hanging="360"/>
+      </w:pPr>
+      <w:rPr>
+        <w:rFonts w:hint="default" w:ascii="Courier New" w:hAnsi="Courier New"/>
+      </w:rPr>
+    </w:lvl>
+    <w:lvl xmlns:w="http://schemas.openxmlformats.org/wordprocessingml/2006/main" w:ilvl="5">
+      <w:start w:val="1"/>
+      <w:numFmt w:val="bullet"/>
+      <w:lvlText w:val=""/>
+      <w:lvlJc w:val="left"/>
+      <w:pPr>
+        <w:ind w:left="4320" w:hanging="360"/>
+      </w:pPr>
+      <w:rPr>
+        <w:rFonts w:hint="default" w:ascii="Wingdings" w:hAnsi="Wingdings"/>
+      </w:rPr>
+    </w:lvl>
+    <w:lvl xmlns:w="http://schemas.openxmlformats.org/wordprocessingml/2006/main" w:ilvl="6">
+      <w:start w:val="1"/>
+      <w:numFmt w:val="bullet"/>
+      <w:lvlText w:val=""/>
+      <w:lvlJc w:val="left"/>
+      <w:pPr>
+        <w:ind w:left="5040" w:hanging="360"/>
+      </w:pPr>
+      <w:rPr>
+        <w:rFonts w:hint="default" w:ascii="Symbol" w:hAnsi="Symbol"/>
+      </w:rPr>
+    </w:lvl>
+    <w:lvl xmlns:w="http://schemas.openxmlformats.org/wordprocessingml/2006/main" w:ilvl="7">
+      <w:start w:val="1"/>
+      <w:numFmt w:val="bullet"/>
+      <w:lvlText w:val="o"/>
+      <w:lvlJc w:val="left"/>
+      <w:pPr>
+        <w:ind w:left="5760" w:hanging="360"/>
+      </w:pPr>
+      <w:rPr>
+        <w:rFonts w:hint="default" w:ascii="Courier New" w:hAnsi="Courier New"/>
+      </w:rPr>
+    </w:lvl>
+    <w:lvl xmlns:w="http://schemas.openxmlformats.org/wordprocessingml/2006/main" w:ilvl="8">
+      <w:start w:val="1"/>
+      <w:numFmt w:val="bullet"/>
+      <w:lvlText w:val=""/>
+      <w:lvlJc w:val="left"/>
+      <w:pPr>
+        <w:ind w:left="6480" w:hanging="360"/>
+      </w:pPr>
+      <w:rPr>
+        <w:rFonts w:hint="default" w:ascii="Wingdings" w:hAnsi="Wingdings"/>
+      </w:rPr>
+    </w:lvl>
+  </w:abstractNum>
   <w:abstractNum w:abstractNumId="0" w15:restartNumberingAfterBreak="0">
     <w:nsid w:val="60560E74"/>
     <w:multiLevelType w:val="multilevel"/>
@@ -1859,6 +1825,9 @@
       </w:pPr>
     </w:lvl>
   </w:abstractNum>
+  <w:num w:numId="2">
+    <w:abstractNumId w:val="1"/>
+  </w:num>
   <w:num w:numId="1" w16cid:durableId="510602751">
     <w:abstractNumId w:val="0"/>
   </w:num>

</xml_diff>